<commit_message>
Modifiziert: Lehrproben nun im 2-Wochen-Versatz Lehrprobe für Kultursensible Interventionen Dimensionen von Hofstede bei Präsentatioin 4 hinzugefügt
</commit_message>
<xml_diff>
--- a/docs/Fahrplan.docx
+++ b/docs/Fahrplan.docx
@@ -18,9 +18,9 @@
         <w:tblLook w:firstRow="0" w:lastRow="0" w:firstColumn="0" w:lastColumn="0" w:noHBand="0" w:noVBand="0" w:val="0000"/>
       </w:tblPr>
       <w:tblGrid>
-        <w:gridCol w:w="1980"/>
-        <w:gridCol w:w="3960"/>
-        <w:gridCol w:w="1980"/>
+        <w:gridCol w:w="2640"/>
+        <w:gridCol w:w="2640"/>
+        <w:gridCol w:w="2640"/>
       </w:tblGrid>
       <w:tr>
         <w:tc>
@@ -118,9 +118,6 @@
             <w:pPr>
               <w:pStyle w:val="Compact"/>
             </w:pPr>
-            <w:r>
-              <w:t xml:space="preserve">1</w:t>
-            </w:r>
           </w:p>
         </w:tc>
       </w:tr>
@@ -153,9 +150,6 @@
             <w:pPr>
               <w:pStyle w:val="Compact"/>
             </w:pPr>
-            <w:r>
-              <w:t xml:space="preserve">2</w:t>
-            </w:r>
           </w:p>
         </w:tc>
       </w:tr>
@@ -178,18 +172,18 @@
               <w:pStyle w:val="Compact"/>
             </w:pPr>
             <w:r>
-              <w:t xml:space="preserve">4 Forschungsethik und Datenschutz</w:t>
-            </w:r>
-          </w:p>
-        </w:tc>
-        <w:tc>
-          <w:tcPr/>
-          <w:p>
-            <w:pPr>
-              <w:pStyle w:val="Compact"/>
-            </w:pPr>
-            <w:r>
-              <w:t xml:space="preserve">3</w:t>
+              <w:t xml:space="preserve">4 Grundlagen kultursensibler Interventionen</w:t>
+            </w:r>
+          </w:p>
+        </w:tc>
+        <w:tc>
+          <w:tcPr/>
+          <w:p>
+            <w:pPr>
+              <w:pStyle w:val="Compact"/>
+            </w:pPr>
+            <w:r>
+              <w:t xml:space="preserve">1</w:t>
             </w:r>
           </w:p>
         </w:tc>
@@ -224,7 +218,7 @@
               <w:pStyle w:val="Compact"/>
             </w:pPr>
             <w:r>
-              <w:t xml:space="preserve">4</w:t>
+              <w:t xml:space="preserve">2</w:t>
             </w:r>
           </w:p>
         </w:tc>
@@ -259,7 +253,7 @@
               <w:pStyle w:val="Compact"/>
             </w:pPr>
             <w:r>
-              <w:t xml:space="preserve">5</w:t>
+              <w:t xml:space="preserve">3</w:t>
             </w:r>
           </w:p>
         </w:tc>
@@ -294,7 +288,7 @@
               <w:pStyle w:val="Compact"/>
             </w:pPr>
             <w:r>
-              <w:t xml:space="preserve">6</w:t>
+              <w:t xml:space="preserve">4</w:t>
             </w:r>
           </w:p>
         </w:tc>
@@ -329,7 +323,7 @@
               <w:pStyle w:val="Compact"/>
             </w:pPr>
             <w:r>
-              <w:t xml:space="preserve">7</w:t>
+              <w:t xml:space="preserve">5</w:t>
             </w:r>
           </w:p>
         </w:tc>
@@ -364,7 +358,7 @@
               <w:pStyle w:val="Compact"/>
             </w:pPr>
             <w:r>
-              <w:t xml:space="preserve">8</w:t>
+              <w:t xml:space="preserve">6</w:t>
             </w:r>
           </w:p>
         </w:tc>
@@ -399,7 +393,7 @@
               <w:pStyle w:val="Compact"/>
             </w:pPr>
             <w:r>
-              <w:t xml:space="preserve">9</w:t>
+              <w:t xml:space="preserve">7</w:t>
             </w:r>
           </w:p>
         </w:tc>
@@ -434,7 +428,7 @@
               <w:pStyle w:val="Compact"/>
             </w:pPr>
             <w:r>
-              <w:t xml:space="preserve">10</w:t>
+              <w:t xml:space="preserve">8</w:t>
             </w:r>
           </w:p>
         </w:tc>
@@ -469,75 +463,8 @@
               <w:pStyle w:val="Compact"/>
             </w:pPr>
             <w:r>
-              <w:t xml:space="preserve">11</w:t>
-            </w:r>
-          </w:p>
-        </w:tc>
-      </w:tr>
-      <w:tr>
-        <w:tc>
-          <w:tcPr/>
-          <w:p>
-            <w:pPr>
-              <w:pStyle w:val="Compact"/>
-            </w:pPr>
-            <w:r>
-              <w:t xml:space="preserve">13.07.26</w:t>
-            </w:r>
-          </w:p>
-        </w:tc>
-        <w:tc>
-          <w:tcPr/>
-          <w:p>
-            <w:pPr>
-              <w:pStyle w:val="Compact"/>
-            </w:pPr>
-            <w:r>
-              <w:t xml:space="preserve">13</w:t>
-            </w:r>
-          </w:p>
-        </w:tc>
-        <w:tc>
-          <w:tcPr/>
-          <w:p>
-            <w:pPr>
-              <w:pStyle w:val="Compact"/>
-            </w:pPr>
-            <w:r>
-              <w:t xml:space="preserve">12</w:t>
-            </w:r>
-          </w:p>
-        </w:tc>
-      </w:tr>
-      <w:tr>
-        <w:tc>
-          <w:tcPr/>
-          <w:p>
-            <w:pPr>
-              <w:pStyle w:val="Compact"/>
-            </w:pPr>
-            <w:r>
-              <w:t xml:space="preserve">20.07.26</w:t>
-            </w:r>
-          </w:p>
-        </w:tc>
-        <w:tc>
-          <w:tcPr/>
-          <w:p>
-            <w:pPr>
-              <w:pStyle w:val="Compact"/>
-            </w:pPr>
-            <w:r>
-              <w:t xml:space="preserve">14 verbleibende Lehrproben, Kriterien der Hausarbeit, Peer-Feedback</w:t>
-            </w:r>
-          </w:p>
-        </w:tc>
-        <w:tc>
-          <w:tcPr/>
-          <w:p>
-            <w:pPr>
-              <w:pStyle w:val="Compact"/>
-            </w:pPr>
+              <w:t xml:space="preserve">9</w:t>
+            </w:r>
           </w:p>
         </w:tc>
       </w:tr>

</xml_diff>